<commit_message>
feat: 完成 FastAPI 后端（T2.1-T2.6）
app/ 五模块：config 读 .env、llm 抽象 ollama/deepseek、rag 解析切片检索生成、db 落对话历史、main 暴露 8 个接口。/upload 支持 pdf/docx/md/txt 并去重；/chat 与 /chat/stream(SSE)；/files 增删；/sessions 取回历史。实测 8895 条语料、进程重启后历史仍在。
</commit_message>
<xml_diff>
--- a/docs/AI学习资料知识库-项目计划书.docx
+++ b/docs/AI学习资料知识库-项目计划书.docx
@@ -4680,14 +4680,15 @@
             <w:pPr>
               <w:spacing w:before="30" w:after="30" w:line="288" w:lineRule="auto"/>
             </w:pPr>
-            <w:r/>
-            <w:r>
-              <w:rPr>
-                <w:rFonts w:ascii="微软雅黑" w:hAnsi="微软雅黑" w:eastAsia="微软雅黑"/>
-                <w:b w:val="0"/>
-                <w:sz w:val="18"/>
-              </w:rPr>
-              <w:t>打开 /docs 能上传文件并提问成功</w:t>
+            <w:r>
+              <w:t>打开 /docs 能上传文件并提问成功（2026/10/20 达成：app/ 后端 + /docs 可测）</w:t>
+            </w:r>
+            <w:r>
+              <w:rPr>
+                <w:rFonts w:ascii="微软雅黑" w:hAnsi="微软雅黑" w:eastAsia="微软雅黑"/>
+                <w:b w:val="0"/>
+                <w:sz w:val="18"/>
+              </w:rPr>
             </w:r>
           </w:p>
         </w:tc>
@@ -16021,14 +16022,15 @@
             <w:pPr>
               <w:spacing w:before="30" w:after="30" w:line="288" w:lineRule="auto"/>
             </w:pPr>
-            <w:r/>
+            <w:r>
+              <w:t>已完成 2026/10/20</w:t>
+            </w:r>
             <w:r>
               <w:rPr>
                 <w:rFonts w:ascii="微软雅黑" w:hAnsi="微软雅黑" w:eastAsia="微软雅黑"/>
                 <w:b w:val="0"/>
                 <w:sz w:val="17"/>
               </w:rPr>
-              <w:t>未开始 □</w:t>
             </w:r>
           </w:p>
         </w:tc>
@@ -16040,7 +16042,9 @@
             <w:pPr>
               <w:spacing w:before="30" w:after="30" w:line="288" w:lineRule="auto"/>
             </w:pPr>
-            <w:r/>
+            <w:r>
+              <w:t>约 2h</w:t>
+            </w:r>
             <w:r>
               <w:rPr>
                 <w:rFonts w:ascii="微软雅黑" w:hAnsi="微软雅黑" w:eastAsia="微软雅黑"/>
@@ -16058,7 +16062,9 @@
             <w:pPr>
               <w:spacing w:before="30" w:after="30" w:line="288" w:lineRule="auto"/>
             </w:pPr>
-            <w:r/>
+            <w:r>
+              <w:t>app/ 下 config/llm/rag/db/main 五模块；逐模块 import 无循环依赖；python -m app.main 可启动</w:t>
+            </w:r>
             <w:r>
               <w:rPr>
                 <w:rFonts w:ascii="微软雅黑" w:hAnsi="微软雅黑" w:eastAsia="微软雅黑"/>
@@ -16116,14 +16122,15 @@
             <w:pPr>
               <w:spacing w:before="30" w:after="30" w:line="288" w:lineRule="auto"/>
             </w:pPr>
-            <w:r/>
+            <w:r>
+              <w:t>已完成 2026/10/20</w:t>
+            </w:r>
             <w:r>
               <w:rPr>
                 <w:rFonts w:ascii="微软雅黑" w:hAnsi="微软雅黑" w:eastAsia="微软雅黑"/>
                 <w:b w:val="0"/>
                 <w:sz w:val="17"/>
               </w:rPr>
-              <w:t>未开始 □</w:t>
             </w:r>
           </w:p>
         </w:tc>
@@ -16135,7 +16142,9 @@
             <w:pPr>
               <w:spacing w:before="30" w:after="30" w:line="288" w:lineRule="auto"/>
             </w:pPr>
-            <w:r/>
+            <w:r>
+              <w:t>约 0.5h</w:t>
+            </w:r>
             <w:r>
               <w:rPr>
                 <w:rFonts w:ascii="微软雅黑" w:hAnsi="微软雅黑" w:eastAsia="微软雅黑"/>
@@ -16153,7 +16162,9 @@
             <w:pPr>
               <w:spacing w:before="30" w:after="30" w:line="288" w:lineRule="auto"/>
             </w:pPr>
-            <w:r/>
+            <w:r>
+              <w:t>get_llm() 支持 ollama/deepseek，全部来自 .env；.env 已忽略、.env.example 入库；无硬编码模型名</w:t>
+            </w:r>
             <w:r>
               <w:rPr>
                 <w:rFonts w:ascii="微软雅黑" w:hAnsi="微软雅黑" w:eastAsia="微软雅黑"/>
@@ -16211,14 +16222,15 @@
             <w:pPr>
               <w:spacing w:before="30" w:after="30" w:line="288" w:lineRule="auto"/>
             </w:pPr>
-            <w:r/>
+            <w:r>
+              <w:t>已完成 2026/10/20</w:t>
+            </w:r>
             <w:r>
               <w:rPr>
                 <w:rFonts w:ascii="微软雅黑" w:hAnsi="微软雅黑" w:eastAsia="微软雅黑"/>
                 <w:b w:val="0"/>
                 <w:sz w:val="17"/>
               </w:rPr>
-              <w:t>未开始 □</w:t>
             </w:r>
           </w:p>
         </w:tc>
@@ -16230,7 +16242,9 @@
             <w:pPr>
               <w:spacing w:before="30" w:after="30" w:line="288" w:lineRule="auto"/>
             </w:pPr>
-            <w:r/>
+            <w:r>
+              <w:t>约 1h</w:t>
+            </w:r>
             <w:r>
               <w:rPr>
                 <w:rFonts w:ascii="微软雅黑" w:hAnsi="微软雅黑" w:eastAsia="微软雅黑"/>
@@ -16248,7 +16262,9 @@
             <w:pPr>
               <w:spacing w:before="30" w:after="30" w:line="288" w:lineRule="auto"/>
             </w:pPr>
-            <w:r/>
+            <w:r>
+              <w:t>POST /upload 支持 pdf/docx/md/txt，返回 chunks/size；非法类型 400；同名覆盖不重复；内容去重</w:t>
+            </w:r>
             <w:r>
               <w:rPr>
                 <w:rFonts w:ascii="微软雅黑" w:hAnsi="微软雅黑" w:eastAsia="微软雅黑"/>
@@ -16306,14 +16322,15 @@
             <w:pPr>
               <w:spacing w:before="30" w:after="30" w:line="288" w:lineRule="auto"/>
             </w:pPr>
-            <w:r/>
+            <w:r>
+              <w:t>已完成 2026/10/20</w:t>
+            </w:r>
             <w:r>
               <w:rPr>
                 <w:rFonts w:ascii="微软雅黑" w:hAnsi="微软雅黑" w:eastAsia="微软雅黑"/>
                 <w:b w:val="0"/>
                 <w:sz w:val="17"/>
               </w:rPr>
-              <w:t>未开始 □</w:t>
             </w:r>
           </w:p>
         </w:tc>
@@ -16325,7 +16342,9 @@
             <w:pPr>
               <w:spacing w:before="30" w:after="30" w:line="288" w:lineRule="auto"/>
             </w:pPr>
-            <w:r/>
+            <w:r>
+              <w:t>约 1h</w:t>
+            </w:r>
             <w:r>
               <w:rPr>
                 <w:rFonts w:ascii="微软雅黑" w:hAnsi="微软雅黑" w:eastAsia="微软雅黑"/>
@@ -16343,7 +16362,9 @@
             <w:pPr>
               <w:spacing w:before="30" w:after="30" w:line="288" w:lineRule="auto"/>
             </w:pPr>
-            <w:r/>
+            <w:r>
+              <w:t>POST /chat 返回 answer+sources+session_id；/chat/stream 为 SSE（sources→token→done），实测 19 个 token 事件</w:t>
+            </w:r>
             <w:r>
               <w:rPr>
                 <w:rFonts w:ascii="微软雅黑" w:hAnsi="微软雅黑" w:eastAsia="微软雅黑"/>
@@ -16401,14 +16422,15 @@
             <w:pPr>
               <w:spacing w:before="30" w:after="30" w:line="288" w:lineRule="auto"/>
             </w:pPr>
-            <w:r/>
+            <w:r>
+              <w:t>已完成 2026/10/20</w:t>
+            </w:r>
             <w:r>
               <w:rPr>
                 <w:rFonts w:ascii="微软雅黑" w:hAnsi="微软雅黑" w:eastAsia="微软雅黑"/>
                 <w:b w:val="0"/>
                 <w:sz w:val="17"/>
               </w:rPr>
-              <w:t>未开始 □</w:t>
             </w:r>
           </w:p>
         </w:tc>
@@ -16420,7 +16442,9 @@
             <w:pPr>
               <w:spacing w:before="30" w:after="30" w:line="288" w:lineRule="auto"/>
             </w:pPr>
-            <w:r/>
+            <w:r>
+              <w:t>约 0.5h</w:t>
+            </w:r>
             <w:r>
               <w:rPr>
                 <w:rFonts w:ascii="微软雅黑" w:hAnsi="微软雅黑" w:eastAsia="微软雅黑"/>
@@ -16438,7 +16462,9 @@
             <w:pPr>
               <w:spacing w:before="30" w:after="30" w:line="288" w:lineRule="auto"/>
             </w:pPr>
-            <w:r/>
+            <w:r>
+              <w:t>GET /files 含文件名/大小/上传时间/切片数；DELETE /files/{name} 同时删向量与磁盘文件</w:t>
+            </w:r>
             <w:r>
               <w:rPr>
                 <w:rFonts w:ascii="微软雅黑" w:hAnsi="微软雅黑" w:eastAsia="微软雅黑"/>
@@ -16496,14 +16522,15 @@
             <w:pPr>
               <w:spacing w:before="30" w:after="30" w:line="288" w:lineRule="auto"/>
             </w:pPr>
-            <w:r/>
+            <w:r>
+              <w:t>已完成 2026/10/20</w:t>
+            </w:r>
             <w:r>
               <w:rPr>
                 <w:rFonts w:ascii="微软雅黑" w:hAnsi="微软雅黑" w:eastAsia="微软雅黑"/>
                 <w:b w:val="0"/>
                 <w:sz w:val="17"/>
               </w:rPr>
-              <w:t>未开始 □</w:t>
             </w:r>
           </w:p>
         </w:tc>
@@ -16515,7 +16542,9 @@
             <w:pPr>
               <w:spacing w:before="30" w:after="30" w:line="288" w:lineRule="auto"/>
             </w:pPr>
-            <w:r/>
+            <w:r>
+              <w:t>约 0.5h</w:t>
+            </w:r>
             <w:r>
               <w:rPr>
                 <w:rFonts w:ascii="微软雅黑" w:hAnsi="微软雅黑" w:eastAsia="微软雅黑"/>
@@ -16533,7 +16562,9 @@
             <w:pPr>
               <w:spacing w:before="30" w:after="30" w:line="288" w:lineRule="auto"/>
             </w:pPr>
-            <w:r/>
+            <w:r>
+              <w:t>SQLite sessions/messages 两表，每轮问答落库；GET /sessions/{id} 可取回；进程重启后历史仍在（已验证）</w:t>
+            </w:r>
             <w:r>
               <w:rPr>
                 <w:rFonts w:ascii="微软雅黑" w:hAnsi="微软雅黑" w:eastAsia="微软雅黑"/>

</xml_diff>

<commit_message>
docs: 补记 T0.3 与 T3.1 进度
</commit_message>
<xml_diff>
--- a/docs/AI学习资料知识库-项目计划书.docx
+++ b/docs/AI学习资料知识库-项目计划书.docx
@@ -15228,14 +15228,15 @@
             <w:pPr>
               <w:spacing w:before="30" w:after="30" w:line="288" w:lineRule="auto"/>
             </w:pPr>
-            <w:r/>
+            <w:r>
+              <w:t>已完成 2026/10/18</w:t>
+            </w:r>
             <w:r>
               <w:rPr>
                 <w:rFonts w:ascii="微软雅黑" w:hAnsi="微软雅黑" w:eastAsia="微软雅黑"/>
                 <w:b w:val="0"/>
                 <w:sz w:val="17"/>
               </w:rPr>
-              <w:t>未开始 □</w:t>
             </w:r>
           </w:p>
         </w:tc>
@@ -15247,7 +15248,9 @@
             <w:pPr>
               <w:spacing w:before="30" w:after="30" w:line="288" w:lineRule="auto"/>
             </w:pPr>
-            <w:r/>
+            <w:r>
+              <w:t>约 1h</w:t>
+            </w:r>
             <w:r>
               <w:rPr>
                 <w:rFonts w:ascii="微软雅黑" w:hAnsi="微软雅黑" w:eastAsia="微软雅黑"/>
@@ -15265,7 +15268,9 @@
             <w:pPr>
               <w:spacing w:before="30" w:after="30" w:line="288" w:lineRule="auto"/>
             </w:pPr>
-            <w:r/>
+            <w:r>
+              <w:t>目录骨架 + git init(main) + .gitignore + README；首个提交 bc045b3，后并入 .gitattributes（4180c67）</w:t>
+            </w:r>
             <w:r>
               <w:rPr>
                 <w:rFonts w:ascii="微软雅黑" w:hAnsi="微软雅黑" w:eastAsia="微软雅黑"/>
@@ -16623,14 +16628,15 @@
             <w:pPr>
               <w:spacing w:before="30" w:after="30" w:line="288" w:lineRule="auto"/>
             </w:pPr>
-            <w:r/>
+            <w:r>
+              <w:t>已完成 2026/10/20</w:t>
+            </w:r>
             <w:r>
               <w:rPr>
                 <w:rFonts w:ascii="微软雅黑" w:hAnsi="微软雅黑" w:eastAsia="微软雅黑"/>
                 <w:b w:val="0"/>
                 <w:sz w:val="17"/>
               </w:rPr>
-              <w:t>未开始 □</w:t>
             </w:r>
           </w:p>
         </w:tc>
@@ -16642,7 +16648,9 @@
             <w:pPr>
               <w:spacing w:before="30" w:after="30" w:line="288" w:lineRule="auto"/>
             </w:pPr>
-            <w:r/>
+            <w:r>
+              <w:t>约 1h</w:t>
+            </w:r>
             <w:r>
               <w:rPr>
                 <w:rFonts w:ascii="微软雅黑" w:hAnsi="微软雅黑" w:eastAsia="微软雅黑"/>
@@ -16660,7 +16668,9 @@
             <w:pPr>
               <w:spacing w:before="30" w:after="30" w:line="288" w:lineRule="auto"/>
             </w:pPr>
-            <w:r/>
+            <w:r>
+              <w:t>ui_streamlit.py：上传区/聊天区/出处展示，调用后端接口；8501 可访问，后端不可达时给提示</w:t>
+            </w:r>
             <w:r>
               <w:rPr>
                 <w:rFonts w:ascii="微软雅黑" w:hAnsi="微软雅黑" w:eastAsia="微软雅黑"/>

</xml_diff>

<commit_message>
fix: 修复 /files 在语料增长后报 500（SQLite too many SQL variables）
现象：界面上传/刷新时报「Request failed with status code 500（后端启动了吗？）」。
排查：/health、/providers、/sessions 都正常，只有 /files 返回 500。

根因：list_files() 用 collection.get(include=["metadatas"]) 一次性取全部记录。
语料从 9,023 片涨到 34,395 片（用户上传了 PostgreSQL 手册 15,669 片、
Adobe PDF 规范 5,499 片等大书）后，拼出的 SQL 参数超过 SQLite 上限，
报 InternalError: too many SQL variables。

修复：
- list_files 改为分页读取（每页 1000 条）再汇总每个文件的切片数
- 前端读取失败提示改为显示后端 detail 与 HTTP 状态码，不再误导成「后端没启动」
- 排查了其他 get() 调用：仅 scripts/06_make_testset.py（一次性实验脚本）仍有 limit=20000，
  运行时路径已无同类问题

验证：/files 返回 200、28 个文件；A1/A5/A6/A9/A10 全部通过。
当前语料：28 个文件、34,395 片、向量库 735MB。计划书 v1.13。
</commit_message>
<xml_diff>
--- a/docs/AI学习资料知识库-项目计划书.docx
+++ b/docs/AI学习资料知识库-项目计划书.docx
@@ -233,7 +233,7 @@
               <w:spacing w:before="30" w:after="30" w:line="288" w:lineRule="auto"/>
             </w:pPr>
             <w:r>
-              <w:t>v1.12</w:t>
+              <w:t>v1.13</w:t>
             </w:r>
             <w:r>
               <w:rPr>
@@ -18953,6 +18953,60 @@
                 <w:sz w:val="18"/>
               </w:rPr>
               <w:t>实测 3 个文件：提交 0.4s 返回，第一个 148 片 50.5s、第二个 122 片 6.0s、md 0.3s（后续文件复用 GPU 向量模型）</w:t>
+            </w:r>
+          </w:p>
+        </w:tc>
+      </w:tr>
+      <w:tr>
+        <w:tc>
+          <w:tcPr>
+            <w:tcW w:type="dxa" w:w="2438"/>
+          </w:tcPr>
+          <w:p>
+            <w:r>
+              <w:rPr>
+                <w:sz w:val="18"/>
+              </w:rPr>
+              <w:t>/files 报 500：语料增长后触发 SQLite 变量上限</w:t>
+            </w:r>
+          </w:p>
+        </w:tc>
+        <w:tc>
+          <w:tcPr>
+            <w:tcW w:type="dxa" w:w="2438"/>
+          </w:tcPr>
+          <w:p>
+            <w:r>
+              <w:rPr>
+                <w:sz w:val="18"/>
+              </w:rPr>
+              <w:t>语料 9,023 片时正常，涨到 34,395 片后 /files 直接 500（too many SQL variables）</w:t>
+            </w:r>
+          </w:p>
+        </w:tc>
+        <w:tc>
+          <w:tcPr>
+            <w:tcW w:type="dxa" w:w="2438"/>
+          </w:tcPr>
+          <w:p>
+            <w:r>
+              <w:rPr>
+                <w:sz w:val="18"/>
+              </w:rPr>
+              <w:t>改为按页读取（每页 1000 条）再汇总切片数；前端错误提示改为显示后端真实 detail 与状态码</w:t>
+            </w:r>
+          </w:p>
+        </w:tc>
+        <w:tc>
+          <w:tcPr>
+            <w:tcW w:type="dxa" w:w="2438"/>
+          </w:tcPr>
+          <w:p>
+            <w:r>
+              <w:rPr>
+                <w:sz w:val="18"/>
+              </w:rPr>
+              <w:t>根因是「一次性 get() 全部记录」的写法，数据量一大必踩；同类写法已排查（仅剩一个实验脚本）</w:t>
             </w:r>
           </w:p>
         </w:tc>

</xml_diff>